<commit_message>
IADB: lab1 report fixed, lab2 almost done
</commit_message>
<xml_diff>
--- a/IADB/Code/Lab_1/Report.docx
+++ b/IADB/Code/Lab_1/Report.docx
@@ -466,25 +466,7 @@
           <w:sz w:val="28"/>
           <w:szCs w:val="28"/>
         </w:rPr>
-        <w:t xml:space="preserve"> </w:t>
-      </w:r>
-      <w:proofErr w:type="spellStart"/>
-      <w:r>
-        <w:rPr>
-          <w:color w:val="000000"/>
-          <w:sz w:val="28"/>
-          <w:szCs w:val="28"/>
-        </w:rPr>
-        <w:t>Нистюк</w:t>
-      </w:r>
-      <w:proofErr w:type="spellEnd"/>
-      <w:r>
-        <w:rPr>
-          <w:color w:val="000000"/>
-          <w:sz w:val="28"/>
-          <w:szCs w:val="28"/>
-        </w:rPr>
-        <w:t xml:space="preserve"> О.А.</w:t>
+        <w:t xml:space="preserve"> Нистюк О.А.</w:t>
       </w:r>
     </w:p>
     <w:p>
@@ -1520,7 +1502,6 @@
                 <w:lang w:val="en-US"/>
               </w:rPr>
             </w:pPr>
-            <w:proofErr w:type="spellStart"/>
             <w:r>
               <w:rPr>
                 <w:sz w:val="28"/>
@@ -1529,7 +1510,6 @@
               </w:rPr>
               <w:t>Product_ID</w:t>
             </w:r>
-            <w:proofErr w:type="spellEnd"/>
           </w:p>
         </w:tc>
         <w:tc>
@@ -1701,7 +1681,6 @@
                 <w:lang w:val="en-US"/>
               </w:rPr>
             </w:pPr>
-            <w:proofErr w:type="spellStart"/>
             <w:r>
               <w:rPr>
                 <w:sz w:val="28"/>
@@ -1710,7 +1689,6 @@
               </w:rPr>
               <w:t>Stock_ID</w:t>
             </w:r>
-            <w:proofErr w:type="spellEnd"/>
           </w:p>
         </w:tc>
         <w:tc>
@@ -2015,7 +1993,6 @@
                 <w:lang w:val="en-US"/>
               </w:rPr>
             </w:pPr>
-            <w:proofErr w:type="spellStart"/>
             <w:r>
               <w:rPr>
                 <w:sz w:val="28"/>
@@ -2024,7 +2001,6 @@
               </w:rPr>
               <w:t>User_ID</w:t>
             </w:r>
-            <w:proofErr w:type="spellEnd"/>
           </w:p>
         </w:tc>
         <w:tc>
@@ -2175,6 +2151,7 @@
               <w:rPr>
                 <w:sz w:val="28"/>
                 <w:szCs w:val="28"/>
+                <w:lang w:val="en-US"/>
               </w:rPr>
             </w:pPr>
             <w:r>
@@ -2183,6 +2160,52 @@
                 <w:szCs w:val="28"/>
               </w:rPr>
               <w:t>Хэш пароля пользователя</w:t>
+            </w:r>
+          </w:p>
+        </w:tc>
+      </w:tr>
+      <w:tr>
+        <w:tc>
+          <w:tcPr>
+            <w:tcW w:w="1980" w:type="dxa"/>
+          </w:tcPr>
+          <w:p>
+            <w:pPr>
+              <w:jc w:val="both"/>
+              <w:rPr>
+                <w:sz w:val="28"/>
+                <w:szCs w:val="28"/>
+                <w:lang w:val="en-US"/>
+              </w:rPr>
+            </w:pPr>
+            <w:r>
+              <w:rPr>
+                <w:sz w:val="28"/>
+                <w:szCs w:val="28"/>
+                <w:lang w:val="en-US"/>
+              </w:rPr>
+              <w:t>Created_at</w:t>
+            </w:r>
+          </w:p>
+        </w:tc>
+        <w:tc>
+          <w:tcPr>
+            <w:tcW w:w="8045" w:type="dxa"/>
+          </w:tcPr>
+          <w:p>
+            <w:pPr>
+              <w:jc w:val="both"/>
+              <w:rPr>
+                <w:sz w:val="28"/>
+                <w:szCs w:val="28"/>
+              </w:rPr>
+            </w:pPr>
+            <w:r>
+              <w:rPr>
+                <w:sz w:val="28"/>
+                <w:szCs w:val="28"/>
+              </w:rPr>
+              <w:t>Время создания записи в таблице</w:t>
             </w:r>
           </w:p>
         </w:tc>
@@ -2226,7 +2249,14 @@
           <w:szCs w:val="28"/>
           <w:lang w:val="en-US"/>
         </w:rPr>
-        <w:t xml:space="preserve">Tasks </w:t>
+        <w:t>Tasks</w:t>
+      </w:r>
+      <w:r>
+        <w:rPr>
+          <w:sz w:val="28"/>
+          <w:szCs w:val="28"/>
+        </w:rPr>
+        <w:t xml:space="preserve"> </w:t>
       </w:r>
       <w:r>
         <w:rPr>
@@ -2342,7 +2372,6 @@
                 <w:lang w:val="en-US"/>
               </w:rPr>
             </w:pPr>
-            <w:proofErr w:type="spellStart"/>
             <w:r>
               <w:rPr>
                 <w:sz w:val="28"/>
@@ -2351,7 +2380,6 @@
               </w:rPr>
               <w:t>Task_ID</w:t>
             </w:r>
-            <w:proofErr w:type="spellEnd"/>
           </w:p>
         </w:tc>
         <w:tc>
@@ -2390,7 +2418,6 @@
                 <w:lang w:val="en-US"/>
               </w:rPr>
             </w:pPr>
-            <w:proofErr w:type="spellStart"/>
             <w:r>
               <w:rPr>
                 <w:sz w:val="28"/>
@@ -2399,7 +2426,6 @@
               </w:rPr>
               <w:t>User_ID</w:t>
             </w:r>
-            <w:proofErr w:type="spellEnd"/>
           </w:p>
         </w:tc>
         <w:tc>
@@ -2446,6 +2472,21 @@
               </w:rPr>
               <w:t>Due</w:t>
             </w:r>
+            <w:r>
+              <w:rPr>
+                <w:sz w:val="28"/>
+                <w:szCs w:val="28"/>
+              </w:rPr>
+              <w:t>_</w:t>
+            </w:r>
+            <w:r>
+              <w:rPr>
+                <w:sz w:val="28"/>
+                <w:szCs w:val="28"/>
+                <w:lang w:val="en-US"/>
+              </w:rPr>
+              <w:t>date</w:t>
+            </w:r>
           </w:p>
         </w:tc>
         <w:tc>
@@ -2559,6 +2600,52 @@
                 <w:szCs w:val="28"/>
               </w:rPr>
               <w:t>Описание задачи</w:t>
+            </w:r>
+          </w:p>
+        </w:tc>
+      </w:tr>
+      <w:tr>
+        <w:tc>
+          <w:tcPr>
+            <w:tcW w:w="1980" w:type="dxa"/>
+          </w:tcPr>
+          <w:p>
+            <w:pPr>
+              <w:jc w:val="both"/>
+              <w:rPr>
+                <w:sz w:val="28"/>
+                <w:szCs w:val="28"/>
+                <w:lang w:val="en-US"/>
+              </w:rPr>
+            </w:pPr>
+            <w:r>
+              <w:rPr>
+                <w:sz w:val="28"/>
+                <w:szCs w:val="28"/>
+                <w:lang w:val="en-US"/>
+              </w:rPr>
+              <w:t>Is_completed</w:t>
+            </w:r>
+          </w:p>
+        </w:tc>
+        <w:tc>
+          <w:tcPr>
+            <w:tcW w:w="8045" w:type="dxa"/>
+          </w:tcPr>
+          <w:p>
+            <w:pPr>
+              <w:jc w:val="both"/>
+              <w:rPr>
+                <w:sz w:val="28"/>
+                <w:szCs w:val="28"/>
+              </w:rPr>
+            </w:pPr>
+            <w:r>
+              <w:rPr>
+                <w:sz w:val="28"/>
+                <w:szCs w:val="28"/>
+              </w:rPr>
+              <w:t>Отметка о завершённости задачи</w:t>
             </w:r>
           </w:p>
         </w:tc>
@@ -2710,7 +2797,6 @@
                 <w:lang w:val="en-US"/>
               </w:rPr>
             </w:pPr>
-            <w:proofErr w:type="spellStart"/>
             <w:r>
               <w:rPr>
                 <w:sz w:val="28"/>
@@ -2719,7 +2805,6 @@
               </w:rPr>
               <w:t>Stock_ID</w:t>
             </w:r>
-            <w:proofErr w:type="spellEnd"/>
           </w:p>
         </w:tc>
         <w:tc>
@@ -2801,19 +2886,24 @@
               <w:rPr>
                 <w:sz w:val="28"/>
                 <w:szCs w:val="28"/>
-                <w:lang w:val="en-US"/>
-              </w:rPr>
-            </w:pPr>
-            <w:proofErr w:type="spellStart"/>
-            <w:r>
-              <w:rPr>
-                <w:sz w:val="28"/>
-                <w:szCs w:val="28"/>
-                <w:lang w:val="en-US"/>
-              </w:rPr>
-              <w:t>Filled_capacity</w:t>
-            </w:r>
-            <w:proofErr w:type="spellEnd"/>
+              </w:rPr>
+            </w:pPr>
+            <w:r>
+              <w:rPr>
+                <w:sz w:val="28"/>
+                <w:szCs w:val="28"/>
+                <w:lang w:val="en-US"/>
+              </w:rPr>
+              <w:t>Filled_</w:t>
+            </w:r>
+            <w:r>
+              <w:rPr>
+                <w:sz w:val="28"/>
+                <w:szCs w:val="28"/>
+                <w:lang w:val="en-US"/>
+              </w:rPr>
+              <w:t>part</w:t>
+            </w:r>
           </w:p>
         </w:tc>
         <w:tc>
@@ -2958,7 +3048,6 @@
           <w:sz w:val="28"/>
           <w:szCs w:val="28"/>
         </w:rPr>
-        <w:lastRenderedPageBreak/>
         <w:t xml:space="preserve">Таблица 4.5 – Сущность </w:t>
       </w:r>
       <w:r>
@@ -3038,7 +3127,6 @@
                 <w:lang w:val="en-US"/>
               </w:rPr>
             </w:pPr>
-            <w:proofErr w:type="spellStart"/>
             <w:r>
               <w:rPr>
                 <w:sz w:val="28"/>
@@ -3047,7 +3135,6 @@
               </w:rPr>
               <w:t>Order_ID</w:t>
             </w:r>
-            <w:proofErr w:type="spellEnd"/>
           </w:p>
         </w:tc>
         <w:tc>
@@ -3086,7 +3173,6 @@
                 <w:lang w:val="en-US"/>
               </w:rPr>
             </w:pPr>
-            <w:proofErr w:type="spellStart"/>
             <w:r>
               <w:rPr>
                 <w:sz w:val="28"/>
@@ -3095,7 +3181,6 @@
               </w:rPr>
               <w:t>Order_date</w:t>
             </w:r>
-            <w:proofErr w:type="spellEnd"/>
           </w:p>
         </w:tc>
         <w:tc>
@@ -3134,7 +3219,6 @@
                 <w:lang w:val="en-US"/>
               </w:rPr>
             </w:pPr>
-            <w:proofErr w:type="spellStart"/>
             <w:r>
               <w:rPr>
                 <w:sz w:val="28"/>
@@ -3143,7 +3227,6 @@
               </w:rPr>
               <w:t>Order_status</w:t>
             </w:r>
-            <w:proofErr w:type="spellEnd"/>
           </w:p>
         </w:tc>
         <w:tc>
@@ -3178,6 +3261,52 @@
                 <w:szCs w:val="28"/>
               </w:rPr>
               <w:t>(создан, собирается, отправлен, удалён и т.д.)</w:t>
+            </w:r>
+          </w:p>
+        </w:tc>
+      </w:tr>
+      <w:tr>
+        <w:tc>
+          <w:tcPr>
+            <w:tcW w:w="1980" w:type="dxa"/>
+          </w:tcPr>
+          <w:p>
+            <w:pPr>
+              <w:jc w:val="both"/>
+              <w:rPr>
+                <w:sz w:val="28"/>
+                <w:szCs w:val="28"/>
+                <w:lang w:val="en-US"/>
+              </w:rPr>
+            </w:pPr>
+            <w:r>
+              <w:rPr>
+                <w:sz w:val="28"/>
+                <w:szCs w:val="28"/>
+                <w:lang w:val="en-US"/>
+              </w:rPr>
+              <w:t>Total_amount</w:t>
+            </w:r>
+          </w:p>
+        </w:tc>
+        <w:tc>
+          <w:tcPr>
+            <w:tcW w:w="8045" w:type="dxa"/>
+          </w:tcPr>
+          <w:p>
+            <w:pPr>
+              <w:jc w:val="both"/>
+              <w:rPr>
+                <w:sz w:val="28"/>
+                <w:szCs w:val="28"/>
+              </w:rPr>
+            </w:pPr>
+            <w:r>
+              <w:rPr>
+                <w:sz w:val="28"/>
+                <w:szCs w:val="28"/>
+              </w:rPr>
+              <w:t>Общая стоимость заказа</w:t>
             </w:r>
           </w:p>
         </w:tc>
@@ -3374,7 +3503,6 @@
                 <w:lang w:val="en-US"/>
               </w:rPr>
             </w:pPr>
-            <w:proofErr w:type="spellStart"/>
             <w:r>
               <w:rPr>
                 <w:sz w:val="28"/>
@@ -3383,7 +3511,6 @@
               </w:rPr>
               <w:t>Item_ID</w:t>
             </w:r>
-            <w:proofErr w:type="spellEnd"/>
           </w:p>
         </w:tc>
         <w:tc>
@@ -3422,7 +3549,6 @@
                 <w:lang w:val="en-US"/>
               </w:rPr>
             </w:pPr>
-            <w:proofErr w:type="spellStart"/>
             <w:r>
               <w:rPr>
                 <w:sz w:val="28"/>
@@ -3431,7 +3557,6 @@
               </w:rPr>
               <w:t>Order_ID</w:t>
             </w:r>
-            <w:proofErr w:type="spellEnd"/>
           </w:p>
         </w:tc>
         <w:tc>
@@ -3479,7 +3604,6 @@
                 <w:lang w:val="en-US"/>
               </w:rPr>
             </w:pPr>
-            <w:proofErr w:type="spellStart"/>
             <w:r>
               <w:rPr>
                 <w:sz w:val="28"/>
@@ -3488,7 +3612,6 @@
               </w:rPr>
               <w:t>Product_ID</w:t>
             </w:r>
-            <w:proofErr w:type="spellEnd"/>
           </w:p>
         </w:tc>
         <w:tc>
@@ -3709,7 +3832,6 @@
                 <w:lang w:val="en-US"/>
               </w:rPr>
             </w:pPr>
-            <w:proofErr w:type="spellStart"/>
             <w:r>
               <w:rPr>
                 <w:sz w:val="28"/>
@@ -3718,7 +3840,6 @@
               </w:rPr>
               <w:t>Pack_ID</w:t>
             </w:r>
-            <w:proofErr w:type="spellEnd"/>
           </w:p>
         </w:tc>
         <w:tc>
@@ -3757,7 +3878,6 @@
                 <w:lang w:val="en-US"/>
               </w:rPr>
             </w:pPr>
-            <w:proofErr w:type="spellStart"/>
             <w:r>
               <w:rPr>
                 <w:sz w:val="28"/>
@@ -3766,7 +3886,6 @@
               </w:rPr>
               <w:t>User_ID</w:t>
             </w:r>
-            <w:proofErr w:type="spellEnd"/>
           </w:p>
         </w:tc>
         <w:tc>
@@ -3813,16 +3932,14 @@
                 <w:lang w:val="en-US"/>
               </w:rPr>
             </w:pPr>
-            <w:proofErr w:type="spellStart"/>
-            <w:r>
-              <w:rPr>
-                <w:sz w:val="28"/>
-                <w:szCs w:val="28"/>
-                <w:lang w:val="en-US"/>
-              </w:rPr>
-              <w:t>Pack_date</w:t>
-            </w:r>
-            <w:proofErr w:type="spellEnd"/>
+            <w:r>
+              <w:rPr>
+                <w:sz w:val="28"/>
+                <w:szCs w:val="28"/>
+                <w:lang w:val="en-US"/>
+              </w:rPr>
+              <w:t>Order_ID</w:t>
+            </w:r>
           </w:p>
         </w:tc>
         <w:tc>
@@ -3835,14 +3952,23 @@
               <w:rPr>
                 <w:sz w:val="28"/>
                 <w:szCs w:val="28"/>
-              </w:rPr>
-            </w:pPr>
-            <w:r>
-              <w:rPr>
-                <w:sz w:val="28"/>
-                <w:szCs w:val="28"/>
-              </w:rPr>
-              <w:t>Дата сборки заказа</w:t>
+                <w:lang w:val="en-US"/>
+              </w:rPr>
+            </w:pPr>
+            <w:r>
+              <w:rPr>
+                <w:sz w:val="28"/>
+                <w:szCs w:val="28"/>
+              </w:rPr>
+              <w:t xml:space="preserve">Связь с сущностью </w:t>
+            </w:r>
+            <w:r>
+              <w:rPr>
+                <w:sz w:val="28"/>
+                <w:szCs w:val="28"/>
+                <w:lang w:val="en-US"/>
+              </w:rPr>
+              <w:t>Orders</w:t>
             </w:r>
           </w:p>
         </w:tc>
@@ -3861,7 +3987,52 @@
                 <w:lang w:val="en-US"/>
               </w:rPr>
             </w:pPr>
-            <w:proofErr w:type="spellStart"/>
+            <w:r>
+              <w:rPr>
+                <w:sz w:val="28"/>
+                <w:szCs w:val="28"/>
+                <w:lang w:val="en-US"/>
+              </w:rPr>
+              <w:t>Pack_date</w:t>
+            </w:r>
+          </w:p>
+        </w:tc>
+        <w:tc>
+          <w:tcPr>
+            <w:tcW w:w="8045" w:type="dxa"/>
+          </w:tcPr>
+          <w:p>
+            <w:pPr>
+              <w:jc w:val="both"/>
+              <w:rPr>
+                <w:sz w:val="28"/>
+                <w:szCs w:val="28"/>
+              </w:rPr>
+            </w:pPr>
+            <w:r>
+              <w:rPr>
+                <w:sz w:val="28"/>
+                <w:szCs w:val="28"/>
+              </w:rPr>
+              <w:t>Дата сборки заказа</w:t>
+            </w:r>
+          </w:p>
+        </w:tc>
+      </w:tr>
+      <w:tr>
+        <w:tc>
+          <w:tcPr>
+            <w:tcW w:w="1980" w:type="dxa"/>
+          </w:tcPr>
+          <w:p>
+            <w:pPr>
+              <w:jc w:val="both"/>
+              <w:rPr>
+                <w:sz w:val="28"/>
+                <w:szCs w:val="28"/>
+                <w:lang w:val="en-US"/>
+              </w:rPr>
+            </w:pPr>
             <w:r>
               <w:rPr>
                 <w:sz w:val="28"/>
@@ -3870,7 +4041,6 @@
               </w:rPr>
               <w:t>Pack_status</w:t>
             </w:r>
-            <w:proofErr w:type="spellEnd"/>
           </w:p>
         </w:tc>
         <w:tc>
@@ -4094,7 +4264,6 @@
                 <w:lang w:val="en-US"/>
               </w:rPr>
             </w:pPr>
-            <w:proofErr w:type="spellStart"/>
             <w:r>
               <w:rPr>
                 <w:sz w:val="28"/>
@@ -4103,7 +4272,6 @@
               </w:rPr>
               <w:t>Item_ID</w:t>
             </w:r>
-            <w:proofErr w:type="spellEnd"/>
           </w:p>
         </w:tc>
         <w:tc>
@@ -4142,7 +4310,6 @@
                 <w:lang w:val="en-US"/>
               </w:rPr>
             </w:pPr>
-            <w:proofErr w:type="spellStart"/>
             <w:r>
               <w:rPr>
                 <w:sz w:val="28"/>
@@ -4151,7 +4318,6 @@
               </w:rPr>
               <w:t>Pack_ID</w:t>
             </w:r>
-            <w:proofErr w:type="spellEnd"/>
           </w:p>
         </w:tc>
         <w:tc>
@@ -4199,7 +4365,6 @@
                 <w:lang w:val="en-US"/>
               </w:rPr>
             </w:pPr>
-            <w:proofErr w:type="spellStart"/>
             <w:r>
               <w:rPr>
                 <w:sz w:val="28"/>
@@ -4208,7 +4373,6 @@
               </w:rPr>
               <w:t>Product_ID</w:t>
             </w:r>
-            <w:proofErr w:type="spellEnd"/>
           </w:p>
         </w:tc>
         <w:tc>
@@ -4302,7 +4466,6 @@
                 <w:lang w:val="en-US"/>
               </w:rPr>
             </w:pPr>
-            <w:proofErr w:type="spellStart"/>
             <w:r>
               <w:rPr>
                 <w:sz w:val="28"/>
@@ -4311,7 +4474,6 @@
               </w:rPr>
               <w:t>Unit_price</w:t>
             </w:r>
-            <w:proofErr w:type="spellEnd"/>
           </w:p>
         </w:tc>
         <w:tc>
@@ -4357,32 +4519,30 @@
     </w:p>
     <w:p>
       <w:pPr>
+        <w:spacing w:before="240" w:after="240"/>
+        <w:ind w:firstLine="708"/>
         <w:jc w:val="both"/>
         <w:rPr>
           <w:sz w:val="28"/>
           <w:szCs w:val="28"/>
         </w:rPr>
       </w:pPr>
-      <w:r>
-        <w:rPr>
-          <w:sz w:val="28"/>
-          <w:szCs w:val="28"/>
-        </w:rPr>
-        <w:t xml:space="preserve">Таблица 4.9. – </w:t>
-      </w:r>
-      <w:r>
-        <w:rPr>
-          <w:sz w:val="28"/>
-          <w:szCs w:val="28"/>
-        </w:rPr>
-        <w:t>О</w:t>
-      </w:r>
-      <w:r>
-        <w:rPr>
-          <w:sz w:val="28"/>
-          <w:szCs w:val="28"/>
-        </w:rPr>
-        <w:t>писание связей между сущностями</w:t>
+    </w:p>
+    <w:p>
+      <w:pPr>
+        <w:jc w:val="both"/>
+        <w:rPr>
+          <w:sz w:val="28"/>
+          <w:szCs w:val="28"/>
+        </w:rPr>
+      </w:pPr>
+      <w:r>
+        <w:rPr>
+          <w:sz w:val="28"/>
+          <w:szCs w:val="28"/>
+        </w:rPr>
+        <w:lastRenderedPageBreak/>
+        <w:t xml:space="preserve">Таблица 4.9 – Отношения между сущностями </w:t>
       </w:r>
     </w:p>
     <w:tbl>
@@ -4503,7 +4663,7 @@
                 <w:szCs w:val="28"/>
                 <w:lang w:val="en-US"/>
               </w:rPr>
-              <w:t>Stocks</w:t>
+              <w:t>Orders</w:t>
             </w:r>
           </w:p>
         </w:tc>
@@ -4526,7 +4686,7 @@
                 <w:szCs w:val="28"/>
                 <w:lang w:val="en-US"/>
               </w:rPr>
-              <w:t>Products</w:t>
+              <w:t>Order_Items</w:t>
             </w:r>
           </w:p>
         </w:tc>
@@ -4564,16 +4724,14 @@
                 <w:lang w:val="en-US"/>
               </w:rPr>
             </w:pPr>
-            <w:proofErr w:type="spellStart"/>
-            <w:r>
-              <w:rPr>
-                <w:sz w:val="28"/>
-                <w:szCs w:val="28"/>
-                <w:lang w:val="en-US"/>
-              </w:rPr>
-              <w:t>Stock_ID</w:t>
-            </w:r>
-            <w:proofErr w:type="spellEnd"/>
+            <w:r>
+              <w:rPr>
+                <w:sz w:val="28"/>
+                <w:szCs w:val="28"/>
+                <w:lang w:val="en-US"/>
+              </w:rPr>
+              <w:t>Order_ID</w:t>
+            </w:r>
           </w:p>
         </w:tc>
       </w:tr>
@@ -4597,7 +4755,7 @@
                 <w:szCs w:val="28"/>
                 <w:lang w:val="en-US"/>
               </w:rPr>
-              <w:t>Products</w:t>
+              <w:t>Users</w:t>
             </w:r>
           </w:p>
         </w:tc>
@@ -4620,7 +4778,7 @@
                 <w:szCs w:val="28"/>
                 <w:lang w:val="en-US"/>
               </w:rPr>
-              <w:t>Order_Items</w:t>
+              <w:t>Tasks</w:t>
             </w:r>
           </w:p>
         </w:tc>
@@ -4658,16 +4816,14 @@
                 <w:lang w:val="en-US"/>
               </w:rPr>
             </w:pPr>
-            <w:proofErr w:type="spellStart"/>
-            <w:r>
-              <w:rPr>
-                <w:sz w:val="28"/>
-                <w:szCs w:val="28"/>
-                <w:lang w:val="en-US"/>
-              </w:rPr>
-              <w:t>Product_ID</w:t>
-            </w:r>
-            <w:proofErr w:type="spellEnd"/>
+            <w:r>
+              <w:rPr>
+                <w:sz w:val="28"/>
+                <w:szCs w:val="28"/>
+                <w:lang w:val="en-US"/>
+              </w:rPr>
+              <w:t>User_ID</w:t>
+            </w:r>
           </w:p>
         </w:tc>
       </w:tr>
@@ -4691,7 +4847,7 @@
                 <w:szCs w:val="28"/>
                 <w:lang w:val="en-US"/>
               </w:rPr>
-              <w:t>Products</w:t>
+              <w:t>Users</w:t>
             </w:r>
           </w:p>
         </w:tc>
@@ -4708,16 +4864,14 @@
                 <w:lang w:val="en-US"/>
               </w:rPr>
             </w:pPr>
-            <w:proofErr w:type="spellStart"/>
-            <w:r>
-              <w:rPr>
-                <w:sz w:val="28"/>
-                <w:szCs w:val="28"/>
-                <w:lang w:val="en-US"/>
-              </w:rPr>
-              <w:t>Pack_Items</w:t>
-            </w:r>
-            <w:proofErr w:type="spellEnd"/>
+            <w:r>
+              <w:rPr>
+                <w:sz w:val="28"/>
+                <w:szCs w:val="28"/>
+                <w:lang w:val="en-US"/>
+              </w:rPr>
+              <w:t>Pack</w:t>
+            </w:r>
           </w:p>
         </w:tc>
         <w:tc>
@@ -4754,131 +4908,13 @@
                 <w:lang w:val="en-US"/>
               </w:rPr>
             </w:pPr>
-            <w:proofErr w:type="spellStart"/>
-            <w:r>
-              <w:rPr>
-                <w:sz w:val="28"/>
-                <w:szCs w:val="28"/>
-                <w:lang w:val="en-US"/>
-              </w:rPr>
-              <w:t>Product_ID</w:t>
-            </w:r>
-            <w:proofErr w:type="spellEnd"/>
-          </w:p>
-        </w:tc>
-      </w:tr>
-    </w:tbl>
-    <w:p>
-      <w:pPr>
-        <w:jc w:val="both"/>
-        <w:rPr>
-          <w:sz w:val="28"/>
-          <w:szCs w:val="28"/>
-        </w:rPr>
-      </w:pPr>
-      <w:r>
-        <w:rPr>
-          <w:sz w:val="28"/>
-          <w:szCs w:val="28"/>
-        </w:rPr>
-        <w:lastRenderedPageBreak/>
-        <w:t>Продолжение таблицы 4.9 – Описание связей между сущностями</w:t>
-      </w:r>
-    </w:p>
-    <w:tbl>
-      <w:tblPr>
-        <w:tblStyle w:val="a4"/>
-        <w:tblW w:w="0" w:type="auto"/>
-        <w:tblLook w:val="04A0" w:firstRow="1" w:lastRow="0" w:firstColumn="1" w:lastColumn="0" w:noHBand="0" w:noVBand="1"/>
-      </w:tblPr>
-      <w:tblGrid>
-        <w:gridCol w:w="2506"/>
-        <w:gridCol w:w="2506"/>
-        <w:gridCol w:w="2506"/>
-        <w:gridCol w:w="2507"/>
-      </w:tblGrid>
-      <w:tr>
-        <w:tc>
-          <w:tcPr>
-            <w:tcW w:w="2506" w:type="dxa"/>
-          </w:tcPr>
-          <w:p>
-            <w:pPr>
-              <w:jc w:val="center"/>
-              <w:rPr>
-                <w:sz w:val="28"/>
-                <w:szCs w:val="28"/>
-              </w:rPr>
-            </w:pPr>
-            <w:r>
-              <w:rPr>
-                <w:sz w:val="28"/>
-                <w:szCs w:val="28"/>
-              </w:rPr>
-              <w:t>Основная таблица</w:t>
-            </w:r>
-          </w:p>
-        </w:tc>
-        <w:tc>
-          <w:tcPr>
-            <w:tcW w:w="2506" w:type="dxa"/>
-          </w:tcPr>
-          <w:p>
-            <w:pPr>
-              <w:jc w:val="center"/>
-              <w:rPr>
-                <w:sz w:val="28"/>
-                <w:szCs w:val="28"/>
-              </w:rPr>
-            </w:pPr>
-            <w:r>
-              <w:rPr>
-                <w:sz w:val="28"/>
-                <w:szCs w:val="28"/>
-              </w:rPr>
-              <w:t>Зависимая таблица</w:t>
-            </w:r>
-          </w:p>
-        </w:tc>
-        <w:tc>
-          <w:tcPr>
-            <w:tcW w:w="2506" w:type="dxa"/>
-          </w:tcPr>
-          <w:p>
-            <w:pPr>
-              <w:jc w:val="center"/>
-              <w:rPr>
-                <w:sz w:val="28"/>
-                <w:szCs w:val="28"/>
-              </w:rPr>
-            </w:pPr>
-            <w:r>
-              <w:rPr>
-                <w:sz w:val="28"/>
-                <w:szCs w:val="28"/>
-              </w:rPr>
-              <w:t>Тип связи</w:t>
-            </w:r>
-          </w:p>
-        </w:tc>
-        <w:tc>
-          <w:tcPr>
-            <w:tcW w:w="2507" w:type="dxa"/>
-          </w:tcPr>
-          <w:p>
-            <w:pPr>
-              <w:jc w:val="center"/>
-              <w:rPr>
-                <w:sz w:val="28"/>
-                <w:szCs w:val="28"/>
-              </w:rPr>
-            </w:pPr>
-            <w:r>
-              <w:rPr>
-                <w:sz w:val="28"/>
-                <w:szCs w:val="28"/>
-              </w:rPr>
-              <w:t>Ключевые поля</w:t>
+            <w:r>
+              <w:rPr>
+                <w:sz w:val="28"/>
+                <w:szCs w:val="28"/>
+                <w:lang w:val="en-US"/>
+              </w:rPr>
+              <w:t>User_ID</w:t>
             </w:r>
           </w:p>
         </w:tc>
@@ -4903,7 +4939,7 @@
                 <w:szCs w:val="28"/>
                 <w:lang w:val="en-US"/>
               </w:rPr>
-              <w:t>Orders</w:t>
+              <w:t>Pack</w:t>
             </w:r>
           </w:p>
         </w:tc>
@@ -4926,7 +4962,7 @@
                 <w:szCs w:val="28"/>
                 <w:lang w:val="en-US"/>
               </w:rPr>
-              <w:t>Order_Items</w:t>
+              <w:t>Pack_Items</w:t>
             </w:r>
           </w:p>
         </w:tc>
@@ -4964,16 +5000,14 @@
                 <w:lang w:val="en-US"/>
               </w:rPr>
             </w:pPr>
-            <w:proofErr w:type="spellStart"/>
-            <w:r>
-              <w:rPr>
-                <w:sz w:val="28"/>
-                <w:szCs w:val="28"/>
-                <w:lang w:val="en-US"/>
-              </w:rPr>
-              <w:t>Order_ID</w:t>
-            </w:r>
-            <w:proofErr w:type="spellEnd"/>
+            <w:r>
+              <w:rPr>
+                <w:sz w:val="28"/>
+                <w:szCs w:val="28"/>
+                <w:lang w:val="en-US"/>
+              </w:rPr>
+              <w:t>Pack_ID</w:t>
+            </w:r>
           </w:p>
         </w:tc>
       </w:tr>
@@ -4997,7 +5031,7 @@
                 <w:szCs w:val="28"/>
                 <w:lang w:val="en-US"/>
               </w:rPr>
-              <w:t>Users</w:t>
+              <w:t>Orders</w:t>
             </w:r>
           </w:p>
         </w:tc>
@@ -5020,7 +5054,7 @@
                 <w:szCs w:val="28"/>
                 <w:lang w:val="en-US"/>
               </w:rPr>
-              <w:t>Tasks</w:t>
+              <w:t>Pack</w:t>
             </w:r>
           </w:p>
         </w:tc>
@@ -5041,7 +5075,7 @@
                 <w:sz w:val="28"/>
                 <w:szCs w:val="28"/>
               </w:rPr>
-              <w:t>Один ко многим</w:t>
+              <w:t>Один к одному</w:t>
             </w:r>
           </w:p>
         </w:tc>
@@ -5058,206 +5092,14 @@
                 <w:lang w:val="en-US"/>
               </w:rPr>
             </w:pPr>
-            <w:proofErr w:type="spellStart"/>
-            <w:r>
-              <w:rPr>
-                <w:sz w:val="28"/>
-                <w:szCs w:val="28"/>
-                <w:lang w:val="en-US"/>
-              </w:rPr>
-              <w:t>User_ID</w:t>
-            </w:r>
-            <w:proofErr w:type="spellEnd"/>
-          </w:p>
-        </w:tc>
-      </w:tr>
-      <w:tr>
-        <w:tc>
-          <w:tcPr>
-            <w:tcW w:w="2506" w:type="dxa"/>
-          </w:tcPr>
-          <w:p>
-            <w:pPr>
-              <w:jc w:val="both"/>
-              <w:rPr>
-                <w:sz w:val="28"/>
-                <w:szCs w:val="28"/>
-                <w:lang w:val="en-US"/>
-              </w:rPr>
-            </w:pPr>
-            <w:r>
-              <w:rPr>
-                <w:sz w:val="28"/>
-                <w:szCs w:val="28"/>
-                <w:lang w:val="en-US"/>
-              </w:rPr>
-              <w:t>Users</w:t>
-            </w:r>
-          </w:p>
-        </w:tc>
-        <w:tc>
-          <w:tcPr>
-            <w:tcW w:w="2506" w:type="dxa"/>
-          </w:tcPr>
-          <w:p>
-            <w:pPr>
-              <w:jc w:val="both"/>
-              <w:rPr>
-                <w:sz w:val="28"/>
-                <w:szCs w:val="28"/>
-                <w:lang w:val="en-US"/>
-              </w:rPr>
-            </w:pPr>
-            <w:r>
-              <w:rPr>
-                <w:sz w:val="28"/>
-                <w:szCs w:val="28"/>
-                <w:lang w:val="en-US"/>
-              </w:rPr>
-              <w:t>Pack</w:t>
-            </w:r>
-          </w:p>
-        </w:tc>
-        <w:tc>
-          <w:tcPr>
-            <w:tcW w:w="2506" w:type="dxa"/>
-          </w:tcPr>
-          <w:p>
-            <w:pPr>
-              <w:jc w:val="both"/>
-              <w:rPr>
-                <w:sz w:val="28"/>
-                <w:szCs w:val="28"/>
-              </w:rPr>
-            </w:pPr>
-            <w:r>
-              <w:rPr>
-                <w:sz w:val="28"/>
-                <w:szCs w:val="28"/>
-              </w:rPr>
-              <w:t>Один ко многим</w:t>
-            </w:r>
-          </w:p>
-        </w:tc>
-        <w:tc>
-          <w:tcPr>
-            <w:tcW w:w="2507" w:type="dxa"/>
-          </w:tcPr>
-          <w:p>
-            <w:pPr>
-              <w:jc w:val="both"/>
-              <w:rPr>
-                <w:sz w:val="28"/>
-                <w:szCs w:val="28"/>
-                <w:lang w:val="en-US"/>
-              </w:rPr>
-            </w:pPr>
-            <w:proofErr w:type="spellStart"/>
-            <w:r>
-              <w:rPr>
-                <w:sz w:val="28"/>
-                <w:szCs w:val="28"/>
-                <w:lang w:val="en-US"/>
-              </w:rPr>
-              <w:t>User_ID</w:t>
-            </w:r>
-            <w:proofErr w:type="spellEnd"/>
-          </w:p>
-        </w:tc>
-      </w:tr>
-      <w:tr>
-        <w:tc>
-          <w:tcPr>
-            <w:tcW w:w="2506" w:type="dxa"/>
-          </w:tcPr>
-          <w:p>
-            <w:pPr>
-              <w:jc w:val="both"/>
-              <w:rPr>
-                <w:sz w:val="28"/>
-                <w:szCs w:val="28"/>
-                <w:lang w:val="en-US"/>
-              </w:rPr>
-            </w:pPr>
-            <w:r>
-              <w:rPr>
-                <w:sz w:val="28"/>
-                <w:szCs w:val="28"/>
-                <w:lang w:val="en-US"/>
-              </w:rPr>
-              <w:t>Pack</w:t>
-            </w:r>
-          </w:p>
-        </w:tc>
-        <w:tc>
-          <w:tcPr>
-            <w:tcW w:w="2506" w:type="dxa"/>
-          </w:tcPr>
-          <w:p>
-            <w:pPr>
-              <w:jc w:val="both"/>
-              <w:rPr>
-                <w:sz w:val="28"/>
-                <w:szCs w:val="28"/>
-                <w:lang w:val="en-US"/>
-              </w:rPr>
-            </w:pPr>
-            <w:proofErr w:type="spellStart"/>
-            <w:r>
-              <w:rPr>
-                <w:sz w:val="28"/>
-                <w:szCs w:val="28"/>
-                <w:lang w:val="en-US"/>
-              </w:rPr>
-              <w:t>Pack_Items</w:t>
-            </w:r>
-            <w:proofErr w:type="spellEnd"/>
-          </w:p>
-        </w:tc>
-        <w:tc>
-          <w:tcPr>
-            <w:tcW w:w="2506" w:type="dxa"/>
-          </w:tcPr>
-          <w:p>
-            <w:pPr>
-              <w:jc w:val="both"/>
-              <w:rPr>
-                <w:sz w:val="28"/>
-                <w:szCs w:val="28"/>
-              </w:rPr>
-            </w:pPr>
-            <w:r>
-              <w:rPr>
-                <w:sz w:val="28"/>
-                <w:szCs w:val="28"/>
-              </w:rPr>
-              <w:t>Один ко многим</w:t>
-            </w:r>
-          </w:p>
-        </w:tc>
-        <w:tc>
-          <w:tcPr>
-            <w:tcW w:w="2507" w:type="dxa"/>
-          </w:tcPr>
-          <w:p>
-            <w:pPr>
-              <w:jc w:val="both"/>
-              <w:rPr>
-                <w:sz w:val="28"/>
-                <w:szCs w:val="28"/>
-                <w:lang w:val="en-US"/>
-              </w:rPr>
-            </w:pPr>
-            <w:proofErr w:type="spellStart"/>
-            <w:r>
-              <w:rPr>
-                <w:sz w:val="28"/>
-                <w:szCs w:val="28"/>
-                <w:lang w:val="en-US"/>
-              </w:rPr>
-              <w:t>Pack_ID</w:t>
-            </w:r>
-            <w:proofErr w:type="spellEnd"/>
+            <w:r>
+              <w:rPr>
+                <w:sz w:val="28"/>
+                <w:szCs w:val="28"/>
+                <w:lang w:val="en-US"/>
+              </w:rPr>
+              <w:t>Order_ID</w:t>
+            </w:r>
           </w:p>
         </w:tc>
       </w:tr>
@@ -5365,10 +5207,10 @@
           <w:noProof/>
         </w:rPr>
         <w:drawing>
-          <wp:inline distT="0" distB="0" distL="0" distR="0" wp14:anchorId="338C1840" wp14:editId="35DA6BBC">
-            <wp:extent cx="6372225" cy="3519805"/>
-            <wp:effectExtent l="0" t="0" r="9525" b="4445"/>
-            <wp:docPr id="7" name="Рисунок 7"/>
+          <wp:inline distT="0" distB="0" distL="0" distR="0" wp14:anchorId="40B61B5A" wp14:editId="5C9B3460">
+            <wp:extent cx="6372225" cy="3903345"/>
+            <wp:effectExtent l="0" t="0" r="9525" b="1905"/>
+            <wp:docPr id="1" name="Рисунок 1"/>
             <wp:cNvGraphicFramePr>
               <a:graphicFrameLocks xmlns:a="http://schemas.openxmlformats.org/drawingml/2006/main" noChangeAspect="1"/>
             </wp:cNvGraphicFramePr>
@@ -5376,13 +5218,13 @@
               <a:graphicData uri="http://schemas.openxmlformats.org/drawingml/2006/picture">
                 <pic:pic xmlns:pic="http://schemas.openxmlformats.org/drawingml/2006/picture">
                   <pic:nvPicPr>
-                    <pic:cNvPr id="0" name="Picture 15"/>
+                    <pic:cNvPr id="0" name="Picture 1"/>
                     <pic:cNvPicPr>
                       <a:picLocks noChangeAspect="1" noChangeArrowheads="1"/>
                     </pic:cNvPicPr>
                   </pic:nvPicPr>
                   <pic:blipFill>
-                    <a:blip r:embed="rId9" cstate="print">
+                    <a:blip r:embed="rId9">
                       <a:extLst>
                         <a:ext uri="{28A0092B-C50C-407E-A947-70E740481C1C}">
                           <a14:useLocalDpi xmlns:a14="http://schemas.microsoft.com/office/drawing/2010/main" val="0"/>
@@ -5397,7 +5239,7 @@
                   <pic:spPr bwMode="auto">
                     <a:xfrm>
                       <a:off x="0" y="0"/>
-                      <a:ext cx="6372225" cy="3519805"/>
+                      <a:ext cx="6372225" cy="3903345"/>
                     </a:xfrm>
                     <a:prstGeom prst="rect">
                       <a:avLst/>
@@ -5506,6 +5348,7 @@
           <w:sz w:val="28"/>
           <w:szCs w:val="28"/>
         </w:rPr>
+        <w:lastRenderedPageBreak/>
         <w:t>Оценка сроков и требуемых ресурсов</w:t>
       </w:r>
     </w:p>
@@ -5562,7 +5405,6 @@
           <w:sz w:val="28"/>
           <w:szCs w:val="28"/>
         </w:rPr>
-        <w:lastRenderedPageBreak/>
         <w:t>Таблица 6.1 – Этапы и сроки выполнения</w:t>
       </w:r>
     </w:p>
@@ -6131,7 +5973,6 @@
     </w:p>
     <w:p>
       <w:pPr>
-        <w:spacing w:before="240"/>
         <w:jc w:val="both"/>
         <w:rPr>
           <w:sz w:val="28"/>
@@ -6143,6 +5984,7 @@
           <w:sz w:val="28"/>
           <w:szCs w:val="28"/>
         </w:rPr>
+        <w:lastRenderedPageBreak/>
         <w:t xml:space="preserve">Таблица 6.2 – </w:t>
       </w:r>
       <w:r>
@@ -6232,7 +6074,7 @@
                 <w:sz w:val="28"/>
                 <w:szCs w:val="28"/>
               </w:rPr>
-              <w:t>Кадровые ресурсы</w:t>
+              <w:t>Программные ресурсы</w:t>
             </w:r>
           </w:p>
         </w:tc>
@@ -6253,24 +6095,52 @@
                 <w:sz w:val="28"/>
                 <w:szCs w:val="28"/>
               </w:rPr>
-              <w:t xml:space="preserve">Бизнес-аналитик, </w:t>
-            </w:r>
-            <w:proofErr w:type="spellStart"/>
-            <w:r>
-              <w:rPr>
-                <w:sz w:val="28"/>
-                <w:szCs w:val="28"/>
-              </w:rPr>
-              <w:t>front</w:t>
-            </w:r>
-            <w:proofErr w:type="spellEnd"/>
-            <w:r>
-              <w:rPr>
-                <w:sz w:val="28"/>
-                <w:szCs w:val="28"/>
-                <w:lang w:val="en-US"/>
-              </w:rPr>
-              <w:t>end</w:t>
+              <w:t>СУБД (</w:t>
+            </w:r>
+            <w:r>
+              <w:rPr>
+                <w:sz w:val="28"/>
+                <w:szCs w:val="28"/>
+                <w:lang w:val="en-US"/>
+              </w:rPr>
+              <w:t>PostgreSQL</w:t>
+            </w:r>
+            <w:r>
+              <w:rPr>
+                <w:sz w:val="28"/>
+                <w:szCs w:val="28"/>
+              </w:rPr>
+              <w:t xml:space="preserve">, </w:t>
+            </w:r>
+            <w:r>
+              <w:rPr>
+                <w:sz w:val="28"/>
+                <w:szCs w:val="28"/>
+                <w:lang w:val="en-US"/>
+              </w:rPr>
+              <w:t>MSSQL</w:t>
+            </w:r>
+            <w:r>
+              <w:rPr>
+                <w:sz w:val="28"/>
+                <w:szCs w:val="28"/>
+              </w:rPr>
+              <w:t xml:space="preserve"> </w:t>
+            </w:r>
+            <w:r>
+              <w:rPr>
+                <w:sz w:val="28"/>
+                <w:szCs w:val="28"/>
+              </w:rPr>
+              <w:t xml:space="preserve">и т.д.), платформа для </w:t>
+            </w:r>
+            <w:r>
+              <w:rPr>
+                <w:sz w:val="28"/>
+                <w:szCs w:val="28"/>
+                <w:lang w:val="en-US"/>
+              </w:rPr>
+              <w:t>backend</w:t>
             </w:r>
             <w:r>
               <w:rPr>
@@ -6284,210 +6154,8 @@
                 <w:sz w:val="28"/>
                 <w:szCs w:val="28"/>
               </w:rPr>
-              <w:t xml:space="preserve">разработчик, </w:t>
-            </w:r>
-            <w:r>
-              <w:rPr>
-                <w:sz w:val="28"/>
-                <w:szCs w:val="28"/>
-                <w:lang w:val="en-US"/>
-              </w:rPr>
-              <w:t>backend</w:t>
-            </w:r>
-            <w:r>
-              <w:rPr>
-                <w:sz w:val="28"/>
-                <w:szCs w:val="28"/>
-              </w:rPr>
-              <w:t>-</w:t>
-            </w:r>
-            <w:r>
-              <w:rPr>
-                <w:sz w:val="28"/>
-                <w:szCs w:val="28"/>
-              </w:rPr>
-              <w:t>разработчик, тестировщик</w:t>
-            </w:r>
-          </w:p>
-        </w:tc>
-      </w:tr>
-    </w:tbl>
-    <w:p>
-      <w:pPr>
-        <w:tabs>
-          <w:tab w:val="left" w:pos="1524"/>
-        </w:tabs>
-        <w:rPr>
-          <w:sz w:val="28"/>
-          <w:szCs w:val="28"/>
-        </w:rPr>
-      </w:pPr>
-      <w:r>
-        <w:rPr>
-          <w:sz w:val="28"/>
-          <w:szCs w:val="28"/>
-        </w:rPr>
-        <w:lastRenderedPageBreak/>
-        <w:t>Продолжение таблицы 6.2 – Требуемые ресурсы</w:t>
-      </w:r>
-    </w:p>
-    <w:tbl>
-      <w:tblPr>
-        <w:tblStyle w:val="a4"/>
-        <w:tblW w:w="0" w:type="auto"/>
-        <w:tblLook w:val="04A0" w:firstRow="1" w:lastRow="0" w:firstColumn="1" w:lastColumn="0" w:noHBand="0" w:noVBand="1"/>
-      </w:tblPr>
-      <w:tblGrid>
-        <w:gridCol w:w="5012"/>
-        <w:gridCol w:w="5013"/>
-      </w:tblGrid>
-      <w:tr>
-        <w:tc>
-          <w:tcPr>
-            <w:tcW w:w="5012" w:type="dxa"/>
-          </w:tcPr>
-          <w:p>
-            <w:pPr>
-              <w:jc w:val="center"/>
-              <w:rPr>
-                <w:sz w:val="28"/>
-                <w:szCs w:val="28"/>
-              </w:rPr>
-            </w:pPr>
-            <w:r>
-              <w:rPr>
-                <w:sz w:val="28"/>
-                <w:szCs w:val="28"/>
-              </w:rPr>
-              <w:t>Тип ресурса</w:t>
-            </w:r>
-          </w:p>
-        </w:tc>
-        <w:tc>
-          <w:tcPr>
-            <w:tcW w:w="5013" w:type="dxa"/>
-          </w:tcPr>
-          <w:p>
-            <w:pPr>
-              <w:jc w:val="center"/>
-              <w:rPr>
-                <w:sz w:val="28"/>
-                <w:szCs w:val="28"/>
-              </w:rPr>
-            </w:pPr>
-            <w:r>
-              <w:rPr>
-                <w:sz w:val="28"/>
-                <w:szCs w:val="28"/>
-              </w:rPr>
-              <w:t>Описание</w:t>
-            </w:r>
-          </w:p>
-        </w:tc>
-      </w:tr>
-      <w:tr>
-        <w:tc>
-          <w:tcPr>
-            <w:tcW w:w="5012" w:type="dxa"/>
-          </w:tcPr>
-          <w:p>
-            <w:pPr>
-              <w:jc w:val="both"/>
-              <w:rPr>
-                <w:sz w:val="28"/>
-                <w:szCs w:val="28"/>
-              </w:rPr>
-            </w:pPr>
-            <w:r>
-              <w:rPr>
-                <w:sz w:val="28"/>
-                <w:szCs w:val="28"/>
-              </w:rPr>
-              <w:t>Программные ресурсы</w:t>
-            </w:r>
-          </w:p>
-        </w:tc>
-        <w:tc>
-          <w:tcPr>
-            <w:tcW w:w="5013" w:type="dxa"/>
-          </w:tcPr>
-          <w:p>
-            <w:pPr>
-              <w:jc w:val="both"/>
-              <w:rPr>
-                <w:sz w:val="28"/>
-                <w:szCs w:val="28"/>
-              </w:rPr>
-            </w:pPr>
-            <w:r>
-              <w:rPr>
-                <w:sz w:val="28"/>
-                <w:szCs w:val="28"/>
-              </w:rPr>
-              <w:t>СУБД (</w:t>
-            </w:r>
-            <w:r>
-              <w:rPr>
-                <w:sz w:val="28"/>
-                <w:szCs w:val="28"/>
-                <w:lang w:val="en-US"/>
-              </w:rPr>
-              <w:t>PostgreSQL</w:t>
-            </w:r>
-            <w:r>
-              <w:rPr>
-                <w:sz w:val="28"/>
-                <w:szCs w:val="28"/>
-              </w:rPr>
-              <w:t xml:space="preserve">, </w:t>
-            </w:r>
-            <w:r>
-              <w:rPr>
-                <w:sz w:val="28"/>
-                <w:szCs w:val="28"/>
-                <w:lang w:val="en-US"/>
-              </w:rPr>
-              <w:t>MSSQL</w:t>
-            </w:r>
-            <w:r>
-              <w:rPr>
-                <w:sz w:val="28"/>
-                <w:szCs w:val="28"/>
-              </w:rPr>
-              <w:t xml:space="preserve"> </w:t>
-            </w:r>
-            <w:r>
-              <w:rPr>
-                <w:sz w:val="28"/>
-                <w:szCs w:val="28"/>
-              </w:rPr>
-              <w:t xml:space="preserve">и т.д.), платформа для </w:t>
-            </w:r>
-            <w:r>
-              <w:rPr>
-                <w:sz w:val="28"/>
-                <w:szCs w:val="28"/>
-                <w:lang w:val="en-US"/>
-              </w:rPr>
-              <w:t>backend</w:t>
-            </w:r>
-            <w:r>
-              <w:rPr>
-                <w:sz w:val="28"/>
-                <w:szCs w:val="28"/>
-              </w:rPr>
-              <w:t>-</w:t>
-            </w:r>
-            <w:proofErr w:type="gramStart"/>
-            <w:r>
-              <w:rPr>
-                <w:sz w:val="28"/>
-                <w:szCs w:val="28"/>
-              </w:rPr>
               <w:t>разработки(</w:t>
             </w:r>
-            <w:proofErr w:type="spellStart"/>
-            <w:proofErr w:type="gramEnd"/>
             <w:r>
               <w:rPr>
                 <w:sz w:val="28"/>
@@ -6496,7 +6164,6 @@
               </w:rPr>
               <w:t>NodeJS</w:t>
             </w:r>
-            <w:proofErr w:type="spellEnd"/>
             <w:r>
               <w:rPr>
                 <w:sz w:val="28"/>
@@ -6713,6 +6380,97 @@
                 <w:szCs w:val="28"/>
               </w:rPr>
               <w:t>Серверы, средства разработки</w:t>
+            </w:r>
+          </w:p>
+        </w:tc>
+      </w:tr>
+      <w:tr>
+        <w:trPr>
+          <w:trHeight w:val="417"/>
+        </w:trPr>
+        <w:tc>
+          <w:tcPr>
+            <w:tcW w:w="5012" w:type="dxa"/>
+          </w:tcPr>
+          <w:p>
+            <w:pPr>
+              <w:jc w:val="both"/>
+              <w:rPr>
+                <w:sz w:val="28"/>
+                <w:szCs w:val="28"/>
+              </w:rPr>
+            </w:pPr>
+            <w:r>
+              <w:rPr>
+                <w:sz w:val="28"/>
+                <w:szCs w:val="28"/>
+              </w:rPr>
+              <w:t>Кадровые ресурсы</w:t>
+            </w:r>
+          </w:p>
+        </w:tc>
+        <w:tc>
+          <w:tcPr>
+            <w:tcW w:w="5013" w:type="dxa"/>
+          </w:tcPr>
+          <w:p>
+            <w:pPr>
+              <w:jc w:val="both"/>
+              <w:rPr>
+                <w:sz w:val="28"/>
+                <w:szCs w:val="28"/>
+              </w:rPr>
+            </w:pPr>
+            <w:r>
+              <w:rPr>
+                <w:sz w:val="28"/>
+                <w:szCs w:val="28"/>
+              </w:rPr>
+              <w:t>Бизнес-аналитик, front</w:t>
+            </w:r>
+            <w:r>
+              <w:rPr>
+                <w:sz w:val="28"/>
+                <w:szCs w:val="28"/>
+                <w:lang w:val="en-US"/>
+              </w:rPr>
+              <w:t>end</w:t>
+            </w:r>
+            <w:r>
+              <w:rPr>
+                <w:sz w:val="28"/>
+                <w:szCs w:val="28"/>
+              </w:rPr>
+              <w:t>-</w:t>
+            </w:r>
+            <w:r>
+              <w:rPr>
+                <w:sz w:val="28"/>
+                <w:szCs w:val="28"/>
+              </w:rPr>
+              <w:t xml:space="preserve">разработчик, </w:t>
+            </w:r>
+            <w:r>
+              <w:rPr>
+                <w:sz w:val="28"/>
+                <w:szCs w:val="28"/>
+                <w:lang w:val="en-US"/>
+              </w:rPr>
+              <w:t>backend</w:t>
+            </w:r>
+            <w:r>
+              <w:rPr>
+                <w:sz w:val="28"/>
+                <w:szCs w:val="28"/>
+              </w:rPr>
+              <w:t>-</w:t>
+            </w:r>
+            <w:r>
+              <w:rPr>
+                <w:sz w:val="28"/>
+                <w:szCs w:val="28"/>
+              </w:rPr>
+              <w:t>разработчик, тестировщик</w:t>
             </w:r>
           </w:p>
         </w:tc>

</xml_diff>

<commit_message>
Lab_1 fixed. UML rework done
</commit_message>
<xml_diff>
--- a/IADB/Code/Lab_1/Report.docx
+++ b/IADB/Code/Lab_1/Report.docx
@@ -1177,7 +1177,7 @@
     <w:p>
       <w:pPr>
         <w:spacing w:before="240" w:after="120"/>
-        <w:jc w:val="both"/>
+        <w:jc w:val="center"/>
         <w:rPr>
           <w:sz w:val="28"/>
           <w:szCs w:val="28"/>
@@ -1188,10 +1188,10 @@
           <w:noProof/>
         </w:rPr>
         <w:drawing>
-          <wp:inline distT="0" distB="0" distL="0" distR="0" wp14:anchorId="4FC9E874" wp14:editId="6D5A1C1C">
-            <wp:extent cx="6372225" cy="5488305"/>
+          <wp:inline distT="0" distB="0" distL="0" distR="0" wp14:anchorId="45AD1836" wp14:editId="663F0DAF">
+            <wp:extent cx="6372225" cy="4921885"/>
             <wp:effectExtent l="0" t="0" r="9525" b="0"/>
-            <wp:docPr id="8" name="Рисунок 8"/>
+            <wp:docPr id="3" name="Рисунок 3"/>
             <wp:cNvGraphicFramePr>
               <a:graphicFrameLocks xmlns:a="http://schemas.openxmlformats.org/drawingml/2006/main" noChangeAspect="1"/>
             </wp:cNvGraphicFramePr>
@@ -1199,7 +1199,7 @@
               <a:graphicData uri="http://schemas.openxmlformats.org/drawingml/2006/picture">
                 <pic:pic xmlns:pic="http://schemas.openxmlformats.org/drawingml/2006/picture">
                   <pic:nvPicPr>
-                    <pic:cNvPr id="0" name="Picture 17"/>
+                    <pic:cNvPr id="0" name="Picture 6"/>
                     <pic:cNvPicPr>
                       <a:picLocks noChangeAspect="1" noChangeArrowheads="1"/>
                     </pic:cNvPicPr>
@@ -1220,7 +1220,7 @@
                   <pic:spPr bwMode="auto">
                     <a:xfrm>
                       <a:off x="0" y="0"/>
-                      <a:ext cx="6372225" cy="5488305"/>
+                      <a:ext cx="6372225" cy="4921885"/>
                     </a:xfrm>
                     <a:prstGeom prst="rect">
                       <a:avLst/>
@@ -1548,7 +1548,6 @@
           <w:sz w:val="28"/>
           <w:szCs w:val="28"/>
         </w:rPr>
-        <w:lastRenderedPageBreak/>
         <w:t>Продолжение таблицы 4.1</w:t>
       </w:r>
       <w:r>
@@ -1687,6 +1686,7 @@
                 <w:szCs w:val="28"/>
                 <w:lang w:val="en-US"/>
               </w:rPr>
+              <w:lastRenderedPageBreak/>
               <w:t>Stock_ID</w:t>
             </w:r>
           </w:p>
@@ -3087,6 +3087,7 @@
                 <w:sz w:val="28"/>
                 <w:szCs w:val="28"/>
               </w:rPr>
+              <w:lastRenderedPageBreak/>
               <w:t>Атрибут</w:t>
             </w:r>
           </w:p>
@@ -4541,7 +4542,6 @@
           <w:sz w:val="28"/>
           <w:szCs w:val="28"/>
         </w:rPr>
-        <w:lastRenderedPageBreak/>
         <w:t xml:space="preserve">Таблица 4.9 – Отношения между сущностями </w:t>
       </w:r>
     </w:p>
@@ -4663,6 +4663,7 @@
                 <w:szCs w:val="28"/>
                 <w:lang w:val="en-US"/>
               </w:rPr>
+              <w:lastRenderedPageBreak/>
               <w:t>Orders</w:t>
             </w:r>
           </w:p>
@@ -5205,7 +5206,6 @@
       <w:r>
         <w:rPr>
           <w:noProof/>
-          <w:lang w:val="en-US"/>
         </w:rPr>
         <w:t>.</w:t>
       </w:r>
@@ -5355,7 +5355,6 @@
           <w:sz w:val="28"/>
           <w:szCs w:val="28"/>
         </w:rPr>
-        <w:lastRenderedPageBreak/>
         <w:t>Оценка сроков и требуемых ресурсов</w:t>
       </w:r>
     </w:p>
@@ -6005,7 +6004,6 @@
           <w:sz w:val="28"/>
           <w:szCs w:val="28"/>
         </w:rPr>
-        <w:lastRenderedPageBreak/>
         <w:t xml:space="preserve">Таблица 6.2 – </w:t>
       </w:r>
       <w:r>
@@ -6095,6 +6093,7 @@
                 <w:sz w:val="28"/>
                 <w:szCs w:val="28"/>
               </w:rPr>
+              <w:lastRenderedPageBreak/>
               <w:t>Программные ресурсы</w:t>
             </w:r>
           </w:p>
@@ -6170,7 +6169,6 @@
               </w:rPr>
               <w:t>-</w:t>
             </w:r>
-            <w:proofErr w:type="gramStart"/>
             <w:r>
               <w:rPr>
                 <w:sz w:val="28"/>
@@ -6178,7 +6176,6 @@
               </w:rPr>
               <w:t>разработки(</w:t>
             </w:r>
-            <w:proofErr w:type="gramEnd"/>
             <w:r>
               <w:rPr>
                 <w:sz w:val="28"/>

</xml_diff>